<commit_message>
Updated Power BI dashboard and project files
</commit_message>
<xml_diff>
--- a/reports/Final_Report.docx
+++ b/reports/Final_Report.docx
@@ -521,23 +521,7 @@
           <w:sz w:val="28"/>
           <w:szCs w:val="28"/>
         </w:rPr>
-        <w:t xml:space="preserve">This project was carried out under the guidance of Bluestock Fintech during the internship period. The project focuses on </w:t>
-      </w:r>
-      <w:r>
-        <w:rPr>
-          <w:rFonts w:ascii="Times New Roman" w:hAnsi="Times New Roman" w:cs="Times New Roman"/>
-          <w:sz w:val="28"/>
-          <w:szCs w:val="28"/>
-        </w:rPr>
-        <w:t>analysing</w:t>
-      </w:r>
-      <w:r>
-        <w:rPr>
-          <w:rFonts w:ascii="Times New Roman" w:hAnsi="Times New Roman" w:cs="Times New Roman"/>
-          <w:sz w:val="28"/>
-          <w:szCs w:val="28"/>
-        </w:rPr>
-        <w:t xml:space="preserve"> mutual fund datasets using modern data analytics techniques and business intelligence tools. It includes data cleaning, database design, exploratory data analysis (EDA), financial performance analysis, advanced risk analytics, and the development of interactive dashboards using Power BI.</w:t>
+        <w:t>This project was carried out under the guidance of Bluestock Fintech during the internship period. The project focuses on analysing mutual fund datasets using modern data analytics techniques and business intelligence tools. It includes data cleaning, database design, exploratory data analysis (EDA), financial performance analysis, advanced risk analytics, and the development of interactive dashboards using Power BI.</w:t>
       </w:r>
     </w:p>
     <w:p>
@@ -594,23 +578,7 @@
           <w:sz w:val="28"/>
           <w:szCs w:val="28"/>
         </w:rPr>
-        <w:t xml:space="preserve">We appreciate the sincere efforts and commitment shown during the successful completion of this capstone project and wish the student continued success in future academic and professional </w:t>
-      </w:r>
-      <w:r>
-        <w:rPr>
-          <w:rFonts w:ascii="Times New Roman" w:hAnsi="Times New Roman" w:cs="Times New Roman"/>
-          <w:sz w:val="28"/>
-          <w:szCs w:val="28"/>
-        </w:rPr>
-        <w:t>endeavours</w:t>
-      </w:r>
-      <w:r>
-        <w:rPr>
-          <w:rFonts w:ascii="Times New Roman" w:hAnsi="Times New Roman" w:cs="Times New Roman"/>
-          <w:sz w:val="28"/>
-          <w:szCs w:val="28"/>
-        </w:rPr>
-        <w:t>.</w:t>
+        <w:t>We appreciate the sincere efforts and commitment shown during the successful completion of this capstone project and wish the student continued success in future academic and professional endeavours.</w:t>
       </w:r>
     </w:p>
     <w:p>
@@ -846,14 +814,6 @@
           <w:szCs w:val="28"/>
         </w:rPr>
       </w:pPr>
-      <w:r>
-        <w:rPr>
-          <w:rFonts w:ascii="Times New Roman" w:hAnsi="Times New Roman" w:cs="Times New Roman"/>
-          <w:sz w:val="28"/>
-          <w:szCs w:val="28"/>
-        </w:rPr>
-        <w:t>Date: __________________</w:t>
-      </w:r>
     </w:p>
     <w:p>
       <w:pPr>
@@ -922,23 +882,7 @@
           <w:sz w:val="28"/>
           <w:szCs w:val="28"/>
         </w:rPr>
-        <w:t xml:space="preserve"> project was developed to </w:t>
-      </w:r>
-      <w:r>
-        <w:rPr>
-          <w:rFonts w:ascii="Times New Roman" w:hAnsi="Times New Roman" w:cs="Times New Roman"/>
-          <w:sz w:val="28"/>
-          <w:szCs w:val="28"/>
-        </w:rPr>
-        <w:t>analyse</w:t>
-      </w:r>
-      <w:r>
-        <w:rPr>
-          <w:rFonts w:ascii="Times New Roman" w:hAnsi="Times New Roman" w:cs="Times New Roman"/>
-          <w:sz w:val="28"/>
-          <w:szCs w:val="28"/>
-        </w:rPr>
-        <w:t xml:space="preserve"> mutual fund data and generate meaningful insights that help investors make better investment decisions. The project uses </w:t>
+        <w:t xml:space="preserve"> project was developed to analyse mutual fund data and generate meaningful insights that help investors make better investment decisions. The project uses </w:t>
       </w:r>
       <w:r>
         <w:rPr>
@@ -956,23 +900,7 @@
           <w:sz w:val="28"/>
           <w:szCs w:val="28"/>
         </w:rPr>
-        <w:t xml:space="preserve"> to process, </w:t>
-      </w:r>
-      <w:r>
-        <w:rPr>
-          <w:rFonts w:ascii="Times New Roman" w:hAnsi="Times New Roman" w:cs="Times New Roman"/>
-          <w:sz w:val="28"/>
-          <w:szCs w:val="28"/>
-        </w:rPr>
-        <w:t>analyse</w:t>
-      </w:r>
-      <w:r>
-        <w:rPr>
-          <w:rFonts w:ascii="Times New Roman" w:hAnsi="Times New Roman" w:cs="Times New Roman"/>
-          <w:sz w:val="28"/>
-          <w:szCs w:val="28"/>
-        </w:rPr>
-        <w:t>, and visualize financial data.</w:t>
+        <w:t xml:space="preserve"> to process, analyse, and visualize financial data.</w:t>
       </w:r>
     </w:p>
     <w:p>
@@ -1010,23 +938,7 @@
           <w:sz w:val="28"/>
           <w:szCs w:val="28"/>
         </w:rPr>
-        <w:t xml:space="preserve">Exploratory Data Analysis (EDA) was performed to identify investment trends, investor </w:t>
-      </w:r>
-      <w:r>
-        <w:rPr>
-          <w:rFonts w:ascii="Times New Roman" w:hAnsi="Times New Roman" w:cs="Times New Roman"/>
-          <w:sz w:val="28"/>
-          <w:szCs w:val="28"/>
-        </w:rPr>
-        <w:t>behaviour</w:t>
-      </w:r>
-      <w:r>
-        <w:rPr>
-          <w:rFonts w:ascii="Times New Roman" w:hAnsi="Times New Roman" w:cs="Times New Roman"/>
-          <w:sz w:val="28"/>
-          <w:szCs w:val="28"/>
-        </w:rPr>
-        <w:t>, and fund performance. Advanced financial metrics such as CAGR, Sharpe Ratio, Sortino Ratio, Alpha, Beta, Maximum Drawdown, Value at Risk (</w:t>
+        <w:t>Exploratory Data Analysis (EDA) was performed to identify investment trends, investor behaviour, and fund performance. Advanced financial metrics such as CAGR, Sharpe Ratio, Sortino Ratio, Alpha, Beta, Maximum Drawdown, Value at Risk (</w:t>
       </w:r>
       <w:proofErr w:type="spellStart"/>
       <w:r>
@@ -2175,18 +2087,7 @@
                 <w:lang w:eastAsia="en-IN"/>
                 <w14:ligatures w14:val="none"/>
               </w:rPr>
-              <w:t>7</w:t>
-            </w:r>
-            <w:r>
-              <w:rPr>
-                <w:rFonts w:ascii="Times New Roman" w:eastAsia="Times New Roman" w:hAnsi="Times New Roman" w:cs="Times New Roman"/>
-                <w:kern w:val="0"/>
-                <w:sz w:val="28"/>
-                <w:szCs w:val="28"/>
-                <w:lang w:eastAsia="en-IN"/>
-                <w14:ligatures w14:val="none"/>
-              </w:rPr>
-              <w:t>,8</w:t>
+              <w:t>7,8</w:t>
             </w:r>
           </w:p>
         </w:tc>
@@ -2609,18 +2510,7 @@
                 <w:lang w:eastAsia="en-IN"/>
                 <w14:ligatures w14:val="none"/>
               </w:rPr>
-              <w:t>1</w:t>
-            </w:r>
-            <w:r>
-              <w:rPr>
-                <w:rFonts w:ascii="Times New Roman" w:eastAsia="Times New Roman" w:hAnsi="Times New Roman" w:cs="Times New Roman"/>
-                <w:kern w:val="0"/>
-                <w:sz w:val="28"/>
-                <w:szCs w:val="28"/>
-                <w:lang w:eastAsia="en-IN"/>
-                <w14:ligatures w14:val="none"/>
-              </w:rPr>
-              <w:t>2</w:t>
+              <w:t>12</w:t>
             </w:r>
           </w:p>
         </w:tc>
@@ -9687,23 +9577,7 @@
           <w:sz w:val="28"/>
           <w:szCs w:val="28"/>
         </w:rPr>
-        <w:t xml:space="preserve">The Mutual Fund Analytics project successfully </w:t>
-      </w:r>
-      <w:r>
-        <w:rPr>
-          <w:rFonts w:ascii="Times New Roman" w:hAnsi="Times New Roman" w:cs="Times New Roman"/>
-          <w:sz w:val="28"/>
-          <w:szCs w:val="28"/>
-        </w:rPr>
-        <w:t>analysed</w:t>
-      </w:r>
-      <w:r>
-        <w:rPr>
-          <w:rFonts w:ascii="Times New Roman" w:hAnsi="Times New Roman" w:cs="Times New Roman"/>
-          <w:sz w:val="28"/>
-          <w:szCs w:val="28"/>
-        </w:rPr>
-        <w:t xml:space="preserve"> mutual fund data using Python, SQL, SQLite, and Power BI. Data cleaning, exploratory analysis, financial performance evaluation, and dashboard development were completed successfully.</w:t>
+        <w:t>The Mutual Fund Analytics project successfully analysed mutual fund data using Python, SQL, SQLite, and Power BI. Data cleaning, exploratory analysis, financial performance evaluation, and dashboard development were completed successfully.</w:t>
       </w:r>
     </w:p>
     <w:p>
@@ -10447,7 +10321,7 @@
           <w:szCs w:val="28"/>
         </w:rPr>
         <w:pict w14:anchorId="64FB0D97">
-          <v:rect id="_x0000_i1157" style="width:0;height:1.5pt" o:hralign="center" o:hrstd="t" o:hr="t" fillcolor="#a0a0a0" stroked="f"/>
+          <v:rect id="_x0000_i1025" style="width:0;height:1.5pt" o:hralign="center" o:hrstd="t" o:hr="t" fillcolor="#a0a0a0" stroked="f"/>
         </w:pict>
       </w:r>
     </w:p>
@@ -13229,6 +13103,7 @@
   <w:style w:type="character" w:default="1" w:styleId="DefaultParagraphFont">
     <w:name w:val="Default Paragraph Font"/>
     <w:uiPriority w:val="1"/>
+    <w:semiHidden/>
     <w:unhideWhenUsed/>
   </w:style>
   <w:style w:type="table" w:default="1" w:styleId="TableNormal">

</xml_diff>